<commit_message>
Add DRP modular monolith skeleton
</commit_message>
<xml_diff>
--- a/docs/research_documents/Mona_DRP_Data_Model_v5_Corrected.docx
+++ b/docs/research_documents/Mona_DRP_Data_Model_v5_Corrected.docx
@@ -167,7 +167,7 @@
                 <w:szCs w:val="20"/>
                 <w:rtl w:val="0"/>
               </w:rPr>
-              <w:t xml:space="preserve">Mona DRP MVP Core veri modelinin güncellenmiş ölçeklenebilirlik uyumlu hâli: 16 tablo, alanları, aralarındaki foreign key ilişkileri ve önerilen index'ler. v2'ye göre alınan şema kararları (crawl_results bölünmesi, evidence_files immutability, rule_results ve exclusions tabloları, uniform created_at) bu belgeye işlenmiştir. Anlam ve şema yapısı v5 scalability revizyonunu kapsar: candidate_discoveries ve blob_storage eklendi, outbox_jobs PGMQ'ye taşındı, JSONB/TEXT guardrail'leri ve partial index'ler eklendi.</w:t>
+              <w:t xml:space="preserve">Mona DRP MVP Core veri modelinin güncellenmiş ölçeklenebilirlik uyumlu hâli: 16 tablo, alanları, aralarındaki foreign key ilişkileri ve önerilen index'ler. v2'ye göre alınan şema kararları (crawl_results bölünmesi, evidence_files immutability, rule_results ve exclusions tabloları, uniform created_at) bu belgeye işlenmiştir. Anlam ve şema yapısı v5 scalability revizyonunu kapsar: candidate_discoveries ve blob_storage eklendi, outbox_jobs PGMQ'ye taşındı, partial index'ler eklendi. Not: JSONB/TEXT boyut guardrail CHECK constraint'leri MVP migration aşamasında bilinçli olarak uygulanmamıştır; büyük içerikler blob_storage'a taşınır, JSONB alanlar küçük metadata için tasarlanır.</w:t>
             </w:r>
             <w:r>
               <w:rPr>
@@ -4366,7 +4366,7 @@
               <w:rPr>
                 <w:rtl w:val="0"/>
               </w:rPr>
-              <w:t xml:space="preserve">string (permutation │ ct_log │ whois_feed │ manual_bulk │ complaint).</w:t>
+              <w:t xml:space="preserve">string. Örn. permutation, ct_log, whois_feed, manual_bulk, complaint, manual vb. DB CHECK constraint yoktur; yeni kaynak tipleri eklenebilir.</w:t>
             </w:r>
           </w:p>
         </w:tc>
@@ -5352,7 +5352,7 @@
                 <w:szCs w:val="19"/>
                 <w:rtl w:val="0"/>
               </w:rPr>
-              <w:t xml:space="preserve">FK → candidate_discoveries.id. NULLABLE — terfi eden adayda dolu; manuel/dış kaynak adayları staging'e uğramadan girebildiği için zorunlu değil.</w:t>
+              <w:t xml:space="preserve">FK → candidate_discoveries.id. NOT NULL.</w:t>
             </w:r>
           </w:p>
         </w:tc>
@@ -5536,7 +5536,7 @@
             </w:tcMar>
             <w:vAlign w:val="center"/>
           </w:tcPr>
-          <w:p>
+          <w:p w14:paraId="00000096A">
             <w:pPr>
               <w:rPr/>
             </w:pPr>
@@ -5550,42 +5550,36 @@
                 <w:szCs w:val="18"/>
                 <w:rtl w:val="0"/>
               </w:rPr>
-              <w:t xml:space="preserve">status</w:t>
-            </w:r>
-            <w:r>
-              <w:rPr>
-                <w:rtl w:val="0"/>
-              </w:rPr>
-            </w:r>
-          </w:p>
-        </w:tc>
-        <w:tc>
-          <w:tcPr>
-            <w:tcBorders>
-              <w:top w:color="cccccc" w:space="0" w:sz="4" w:val="single"/>
-              <w:left w:color="cccccc" w:space="0" w:sz="4" w:val="single"/>
-              <w:bottom w:color="cccccc" w:space="0" w:sz="4" w:val="single"/>
-              <w:right w:color="cccccc" w:space="0" w:sz="4" w:val="single"/>
-            </w:tcBorders>
-            <w:tcMar>
-              <w:top w:w="60.0" w:type="dxa"/>
-              <w:left w:w="120.0" w:type="dxa"/>
-              <w:bottom w:w="60.0" w:type="dxa"/>
-              <w:right w:w="120.0" w:type="dxa"/>
-            </w:tcMar>
-          </w:tcPr>
-          <w:p>
-            <w:pPr>
-              <w:rPr/>
-            </w:pPr>
-            <w:r>
-              <w:rPr>
-                <w:rtl w:val="0"/>
-              </w:rPr>
-              <w:t xml:space="preserve">string (validated → crawled → analyzed → scored → reviewed → closed | eliminated | error).</w:t>
-              <w:br w:type="textWrapping"/>
-              <w:br w:type="textWrapping"/>
-              <w:t xml:space="preserve">Not: whitelisted, candidates aşamasına gelmiş bir adayın istisnai manuel kapatması için terminal status olarak kullanılabilir. Normal dışlama akışı candidate_discoveries.skip_reason üzerinden yürür.</w:t>
+              <w:t xml:space="preserve">normalized_value</w:t>
+            </w:r>
+          </w:p>
+        </w:tc>
+        <w:tc>
+          <w:tcPr>
+            <w:tcBorders>
+              <w:top w:color="cccccc" w:space="0" w:sz="4" w:val="single"/>
+              <w:left w:color="cccccc" w:space="0" w:sz="4" w:val="single"/>
+              <w:bottom w:color="cccccc" w:space="0" w:sz="4" w:val="single"/>
+              <w:right w:color="cccccc" w:space="0" w:sz="4" w:val="single"/>
+            </w:tcBorders>
+            <w:tcMar>
+              <w:top w:w="60.0" w:type="dxa"/>
+              <w:left w:w="120.0" w:type="dxa"/>
+              <w:bottom w:w="60.0" w:type="dxa"/>
+              <w:right w:w="120.0" w:type="dxa"/>
+            </w:tcMar>
+          </w:tcPr>
+          <w:p w14:paraId="00000096B">
+            <w:pPr>
+              <w:rPr/>
+            </w:pPr>
+            <w:r>
+              <w:rPr>
+                <w:sz w:val="19"/>
+                <w:szCs w:val="19"/>
+                <w:rtl w:val="0"/>
+              </w:rPr>
+              <w:t xml:space="preserve">TEXT. NOT NULL. Normalize edilmiş aday değeri. Candidate seviyesinde duplicate backstop için kullanılır. UNIQUE INDEX: candidates(entity_id, normalized_value) WHERE status NOT IN ('closed','eliminated').</w:t>
             </w:r>
           </w:p>
         </w:tc>
@@ -5625,6 +5619,81 @@
                 <w:szCs w:val="18"/>
                 <w:rtl w:val="0"/>
               </w:rPr>
+              <w:t xml:space="preserve">status</w:t>
+            </w:r>
+            <w:r>
+              <w:rPr>
+                <w:rtl w:val="0"/>
+              </w:rPr>
+            </w:r>
+          </w:p>
+        </w:tc>
+        <w:tc>
+          <w:tcPr>
+            <w:tcBorders>
+              <w:top w:color="cccccc" w:space="0" w:sz="4" w:val="single"/>
+              <w:left w:color="cccccc" w:space="0" w:sz="4" w:val="single"/>
+              <w:bottom w:color="cccccc" w:space="0" w:sz="4" w:val="single"/>
+              <w:right w:color="cccccc" w:space="0" w:sz="4" w:val="single"/>
+            </w:tcBorders>
+            <w:tcMar>
+              <w:top w:w="60.0" w:type="dxa"/>
+              <w:left w:w="120.0" w:type="dxa"/>
+              <w:bottom w:w="60.0" w:type="dxa"/>
+              <w:right w:w="120.0" w:type="dxa"/>
+            </w:tcMar>
+          </w:tcPr>
+          <w:p>
+            <w:pPr>
+              <w:rPr/>
+            </w:pPr>
+            <w:r>
+              <w:rPr>
+                <w:rtl w:val="0"/>
+              </w:rPr>
+              <w:t xml:space="preserve">string (validated → crawled → analyzed → scored → reviewed → closed | eliminated | error).</w:t>
+              <w:br w:type="textWrapping"/>
+              <w:br w:type="textWrapping"/>
+              <w:t xml:space="preserve">Not: whitelisted bu listede yer almaz. Whitelist akışı candidate öncesinde candidate_discoveries.skip_reason = 'whitelisted' ile temsil edilir. Candidate aşamasına gelmiş bir aday masum bulunursa reviews.decision = 'false_positive' veya candidates.status = 'eliminated' kullanılır.</w:t>
+            </w:r>
+          </w:p>
+        </w:tc>
+      </w:tr>
+      <w:tr>
+        <w:trPr>
+          <w:cantSplit w:val="0"/>
+          <w:tblHeader w:val="0"/>
+        </w:trPr>
+        <w:tc>
+          <w:tcPr>
+            <w:tcBorders>
+              <w:top w:color="cccccc" w:space="0" w:sz="4" w:val="single"/>
+              <w:left w:color="cccccc" w:space="0" w:sz="4" w:val="single"/>
+              <w:bottom w:color="cccccc" w:space="0" w:sz="4" w:val="single"/>
+              <w:right w:color="cccccc" w:space="0" w:sz="4" w:val="single"/>
+            </w:tcBorders>
+            <w:tcMar>
+              <w:top w:w="60.0" w:type="dxa"/>
+              <w:left w:w="120.0" w:type="dxa"/>
+              <w:bottom w:w="60.0" w:type="dxa"/>
+              <w:right w:w="120.0" w:type="dxa"/>
+            </w:tcMar>
+            <w:vAlign w:val="center"/>
+          </w:tcPr>
+          <w:p>
+            <w:pPr>
+              <w:rPr/>
+            </w:pPr>
+            <w:r>
+              <w:rPr>
+                <w:rFonts w:ascii="Consolas" w:cs="Consolas" w:eastAsia="Consolas" w:hAnsi="Consolas"/>
+                <w:b w:val="1"/>
+                <w:bCs w:val="1"/>
+                <w:color w:val="1f4e79"/>
+                <w:sz w:val="18"/>
+                <w:szCs w:val="18"/>
+                <w:rtl w:val="0"/>
+              </w:rPr>
               <w:t xml:space="preserve">metadata</w:t>
             </w:r>
             <w:r>
@@ -5659,7 +5728,7 @@
                 <w:szCs w:val="19"/>
                 <w:rtl w:val="0"/>
               </w:rPr>
-              <w:t xml:space="preserve">JSONB. Sadece küçük provenance bilgileri: complaint_id, ct_cert_id, üretildiği orijinal domain. Ham DNS/HTTP response veya büyük payload girilmez. CHECK: 2KB.</w:t>
+              <w:t xml:space="preserve">JSONB. Sadece küçük provenance bilgileri: complaint_id, ct_cert_id, üretildiği orijinal domain. Ham DNS/HTTP response veya büyük payload girilmez.</w:t>
             </w:r>
             <w:r>
               <w:rPr>
@@ -6250,7 +6319,7 @@
                 <w:szCs w:val="19"/>
                 <w:rtl w:val="0"/>
               </w:rPr>
-              <w:t xml:space="preserve">Yönlendirme zinciri. CHECK: max 30 hop ve 4KB.</w:t>
+              <w:t xml:space="preserve">Yönlendirme zinciri. JSONB array. Max 30 hop.</w:t>
             </w:r>
             <w:r>
               <w:rPr>
@@ -6873,7 +6942,7 @@
               <w:rPr>
                 <w:rtl w:val="0"/>
               </w:rPr>
-              <w:t xml:space="preserve">JSONB slim/telemetri: ssl_info, server_header, content_type, fetch_duration_ms, blocked_by_bot_protection, crawl_user_agent. Full HTML veya raw response girmez. CHECK: 4KB.</w:t>
+              <w:t xml:space="preserve">JSONB slim/telemetri: ssl_info, server_header, content_type, fetch_duration_ms, blocked_by_bot_protection, crawl_user_agent. Full HTML veya raw response girmez.</w:t>
             </w:r>
           </w:p>
         </w:tc>
@@ -7660,7 +7729,7 @@
                 <w:szCs w:val="19"/>
                 <w:rtl w:val="0"/>
               </w:rPr>
-              <w:t xml:space="preserve">JSONB. Yapısal özet: form_count, input_count, password_input_count, button_count, external_script_count gibi küçük sayısal özetler. Full DOM buraya gelmez; tam DOM crawl_results.storage_ref üzerinden blob_storage'da. CHECK: 8KB.</w:t>
+              <w:t xml:space="preserve">JSONB. Yapısal özet: form_count, input_count, password_input_count, button_count, external_script_count gibi küçük sayısal özetler. Full DOM buraya gelmez; tam DOM crawl_results.storage_ref üzerinden blob_storage'da.</w:t>
             </w:r>
             <w:r>
               <w:rPr>
@@ -8498,7 +8567,7 @@
               <w:rPr>
                 <w:rtl w:val="0"/>
               </w:rPr>
-              <w:t xml:space="preserve">JSONB. Skorun nasıl hesaplandığını anlatan küçük teknik özet. Logo binary, favicon binary, screenshot veya full DOM buraya gelmez; büyük içerikler blob_storage/evidence_files üzerinden saklanır. CHECK: 4KB.</w:t>
+              <w:t xml:space="preserve">JSONB. Skorun nasıl hesaplandığını anlatan küçük teknik özet. Logo binary, favicon binary, screenshot veya full DOM buraya gelmez; büyük içerikler blob_storage/evidence_files üzerinden saklanır.</w:t>
             </w:r>
           </w:p>
         </w:tc>
@@ -9198,7 +9267,7 @@
                 <w:szCs w:val="19"/>
                 <w:rtl w:val="0"/>
               </w:rPr>
-              <w:t xml:space="preserve">JSONB. Sinyalin özeti: matched_brand, confidence, matched_text_snippet, field/source bilgisi. Ham OCR çıktısı, full HTML veya uzun text dump girmez → evidence_files.storage_ref. CHECK: 4KB.</w:t>
+              <w:t xml:space="preserve">JSONB. Sinyalin özeti: matched_brand, confidence, matched_text_snippet, field/source bilgisi. Ham OCR çıktısı, full HTML veya uzun text dump girmez → evidence_files.storage_ref.</w:t>
             </w:r>
             <w:r>
               <w:rPr>
@@ -9275,7 +9344,7 @@
               <w:rPr>
                 <w:rtl w:val="0"/>
               </w:rPr>
-              <w:t xml:space="preserve">JSONB. Küçük teknik metadata. Full HTML, raw OCR, screenshot, binary/base64 veya uzun text dump içermez. CHECK: 4KB.</w:t>
+              <w:t xml:space="preserve">JSONB. Küçük teknik metadata. Full HTML, raw OCR, screenshot, binary/base64 veya uzun text dump içermez.</w:t>
             </w:r>
           </w:p>
         </w:tc>
@@ -10020,7 +10089,7 @@
               <w:rPr>
                 <w:rtl w:val="0"/>
               </w:rPr>
-              <w:t xml:space="preserve">JSONB slim. Kısa karar gerekçeleri ve küçük bağlam bilgisi. Full rule dump, uzun LLM response veya ham sinyal çıktısı içermez. CHECK: 4KB.</w:t>
+              <w:t xml:space="preserve">JSONB slim. Kısa karar gerekçeleri ve küçük bağlam bilgisi. Full rule dump, uzun LLM response veya ham sinyal çıktısı içermez.</w:t>
             </w:r>
           </w:p>
         </w:tc>
@@ -10094,7 +10163,7 @@
                 <w:szCs w:val="19"/>
                 <w:rtl w:val="0"/>
               </w:rPr>
-              <w:t xml:space="preserve">TEXT. Özet karar açıklaması. Full LLM response veya reasoning log girmez. CHECK: 5000 karakter.</w:t>
+              <w:t xml:space="preserve">TEXT. NULLABLE. Özet karar açıklaması. Full LLM response veya reasoning log girmez.</w:t>
             </w:r>
             <w:r>
               <w:rPr>
@@ -10757,7 +10826,7 @@
               <w:rPr>
                 <w:rtl w:val="0"/>
               </w:rPr>
-              <w:t xml:space="preserve">JSONB. NULLABLE. Kuralın küçük açıklama detayı. Full HTML, OCR, screenshot veya uzun sinyal çıktısı içermez. CHECK: 4KB.</w:t>
+              <w:t xml:space="preserve">JSONB. NULLABLE. Kuralın küçük açıklama detayı. Full HTML, OCR, screenshot veya uzun sinyal çıktısı içermez.</w:t>
             </w:r>
           </w:p>
         </w:tc>
@@ -11185,7 +11254,7 @@
                 <w:szCs w:val="19"/>
                 <w:rtl w:val="0"/>
               </w:rPr>
-              <w:t xml:space="preserve">FK → risk_scores.id. NULLABLE.</w:t>
+              <w:t xml:space="preserve">FK → risk_scores.id. NOT NULL.</w:t>
             </w:r>
             <w:r>
               <w:rPr>
@@ -11934,7 +12003,7 @@
                 <w:szCs w:val="19"/>
                 <w:rtl w:val="0"/>
               </w:rPr>
-              <w:t xml:space="preserve">FK → reviews.id. NULLABLE.</w:t>
+              <w:t xml:space="preserve">FK → reviews.id. NOT NULL.</w:t>
             </w:r>
             <w:r>
               <w:rPr>
@@ -12940,7 +13009,7 @@
                 <w:szCs w:val="18"/>
                 <w:rtl w:val="0"/>
               </w:rPr>
-              <w:t xml:space="preserve">timestamp</w:t>
+              <w:t xml:space="preserve">captured_at</w:t>
             </w:r>
             <w:r>
               <w:rPr>
@@ -16087,7 +16156,7 @@
                 <w:szCs w:val="19"/>
                 <w:rtl w:val="0"/>
               </w:rPr>
-              <w:t xml:space="preserve">Nullable</w:t>
+              <w:t xml:space="preserve">Zorunlu</w:t>
             </w:r>
             <w:r>
               <w:rPr>
@@ -16307,7 +16376,7 @@
                 <w:szCs w:val="19"/>
                 <w:rtl w:val="0"/>
               </w:rPr>
-              <w:t xml:space="preserve">Nullable</w:t>
+              <w:t xml:space="preserve">Zorunlu</w:t>
             </w:r>
             <w:r>
               <w:rPr>
@@ -16854,7 +16923,7 @@
                 <w:szCs w:val="18"/>
                 <w:rtl w:val="0"/>
               </w:rPr>
-              <w:t xml:space="preserve">Nullable</w:t>
+              <w:t xml:space="preserve">Zorunlu</w:t>
             </w:r>
             <w:r>
               <w:rPr>

</xml_diff>